<commit_message>
Phase 3 second pass: match KM design system exactly + fix header/footer KM-identifier leak (new verify_no_km_identifiers gate)
</commit_message>
<xml_diff>
--- a/worlds/ondina-vasquell/phase-3-build-task-artifacts/supplementary-files/diabetes_foot_care_education_05212026.docx
+++ b/worlds/ondina-vasquell/phase-3-build-task-artifacts/supplementary-files/diabetes_foot_care_education_05212026.docx
@@ -6,6 +6,14 @@
       <w:tblPr>
         <w:tblW w:type="auto" w:w="0"/>
         <w:tblLook w:firstColumn="1" w:firstRow="1" w:lastColumn="0" w:lastRow="0" w:noHBand="0" w:noVBand="1" w:val="04A0"/>
+        <w:tblBorders>
+          <w:top w:val="none"/>
+          <w:left w:val="none"/>
+          <w:bottom w:val="none"/>
+          <w:right w:val="none"/>
+          <w:insideH w:val="none"/>
+          <w:insideV w:val="none"/>
+        </w:tblBorders>
       </w:tblPr>
       <w:tblGrid>
         <w:gridCol w:w="5184"/>
@@ -21,7 +29,8 @@
               <w:rPr>
                 <w:rFonts w:ascii="Arial" w:hAnsi="Arial"/>
                 <w:b/>
-                <w:color w:val="000000"/>
+                <w:i w:val="0"/>
+                <w:color w:val="1F3864"/>
                 <w:sz w:val="22"/>
               </w:rPr>
               <w:t>Harbor Crest Regional Medical Center</w:t>
@@ -39,27 +48,57 @@
             <w:r>
               <w:rPr>
                 <w:rFonts w:ascii="Arial" w:hAnsi="Arial"/>
-                <w:color w:val="595959"/>
-                <w:sz w:val="15"/>
+                <w:b/>
+                <w:i w:val="0"/>
+                <w:color w:val="4472C4"/>
+                <w:sz w:val="17"/>
               </w:rPr>
-              <w:t>Confidential - Filed 05/21/2026</w:t>
+              <w:t>Confidential</w:t>
             </w:r>
           </w:p>
         </w:tc>
       </w:tr>
     </w:tbl>
-    <w:p/>
     <w:tbl>
       <w:tblPr>
         <w:tblW w:type="auto" w:w="0"/>
         <w:tblLook w:firstColumn="1" w:firstRow="1" w:lastColumn="0" w:lastRow="0" w:noHBand="0" w:noVBand="1" w:val="04A0"/>
         <w:tblBorders>
-          <w:top w:val="single" w:sz="4" w:space="0" w:color="BFBFBF"/>
-          <w:left w:val="single" w:sz="4" w:space="0" w:color="BFBFBF"/>
-          <w:bottom w:val="single" w:sz="4" w:space="0" w:color="BFBFBF"/>
-          <w:right w:val="single" w:sz="4" w:space="0" w:color="BFBFBF"/>
-          <w:insideH w:val="single" w:sz="4" w:space="0" w:color="BFBFBF"/>
-          <w:insideV w:val="single" w:sz="4" w:space="0" w:color="BFBFBF"/>
+          <w:top w:val="none"/>
+          <w:left w:val="none"/>
+          <w:bottom w:val="none"/>
+          <w:right w:val="none"/>
+          <w:insideH w:val="none"/>
+          <w:insideV w:val="none"/>
+        </w:tblBorders>
+      </w:tblPr>
+      <w:tblGrid>
+        <w:gridCol w:w="10368"/>
+      </w:tblGrid>
+      <w:tr>
+        <w:trPr>
+          <w:trHeight w:val="40"/>
+        </w:trPr>
+        <w:tc>
+          <w:tcPr>
+            <w:tcW w:type="dxa" w:w="10368"/>
+            <w:shd w:val="clear" w:fill="4472C4"/>
+          </w:tcPr>
+          <w:p/>
+        </w:tc>
+      </w:tr>
+    </w:tbl>
+    <w:tbl>
+      <w:tblPr>
+        <w:tblW w:type="auto" w:w="0"/>
+        <w:tblLook w:firstColumn="1" w:firstRow="1" w:lastColumn="0" w:lastRow="0" w:noHBand="0" w:noVBand="1" w:val="04A0"/>
+        <w:tblBorders>
+          <w:top w:val="single" w:sz="4" w:color="C9D4EA"/>
+          <w:left w:val="single" w:sz="4" w:color="C9D4EA"/>
+          <w:bottom w:val="single" w:sz="4" w:color="C9D4EA"/>
+          <w:right w:val="single" w:sz="4" w:color="C9D4EA"/>
+          <w:insideH w:val="single" w:sz="4" w:color="C9D4EA"/>
+          <w:insideV w:val="single" w:sz="4" w:color="C9D4EA"/>
         </w:tblBorders>
       </w:tblPr>
       <w:tblGrid>
@@ -71,28 +110,51 @@
       <w:tr>
         <w:tc>
           <w:tcPr>
-            <w:tcW w:type="dxa" w:w="10368"/>
-            <w:gridSpan w:val="4"/>
-            <w:shd w:val="clear" w:color="auto" w:fill="EAEAEA"/>
+            <w:tcW w:type="dxa" w:w="7776"/>
+            <w:gridSpan w:val="3"/>
+            <w:shd w:val="clear" w:fill="4472C4"/>
           </w:tcPr>
           <w:p>
             <w:r>
               <w:rPr>
                 <w:rFonts w:ascii="Arial" w:hAnsi="Arial"/>
                 <w:b/>
-                <w:color w:val="000000"/>
-                <w:sz w:val="22"/>
+                <w:i w:val="0"/>
+                <w:color w:val="FFFFFF"/>
+                <w:sz w:val="26"/>
               </w:rPr>
-              <w:t>Ondina Vasquell</w:t>
+              <w:t xml:space="preserve">  Ondina Vasquell</w:t>
             </w:r>
             <w:r>
               <w:rPr>
                 <w:rFonts w:ascii="Arial" w:hAnsi="Arial"/>
-                <w:b/>
-                <w:color w:val="000000"/>
+                <w:b w:val="0"/>
+                <w:i w:val="0"/>
+                <w:color w:val="FFFFFF"/>
                 <w:sz w:val="18"/>
               </w:rPr>
-              <w:t xml:space="preserve">      MRN OV-3358104</w:t>
+              <w:t xml:space="preserve">    68 y  |  Female  |  DOB 03/14/1958</w:t>
+            </w:r>
+          </w:p>
+        </w:tc>
+        <w:tc>
+          <w:tcPr>
+            <w:tcW w:type="dxa" w:w="2592"/>
+            <w:shd w:val="clear" w:fill="4472C4"/>
+          </w:tcPr>
+          <w:p>
+            <w:pPr>
+              <w:jc w:val="right"/>
+            </w:pPr>
+            <w:r>
+              <w:rPr>
+                <w:rFonts w:ascii="Arial" w:hAnsi="Arial"/>
+                <w:b/>
+                <w:i w:val="0"/>
+                <w:color w:val="FFFFFF"/>
+                <w:sz w:val="20"/>
+              </w:rPr>
+              <w:t xml:space="preserve">MRN OV-3358104  </w:t>
             </w:r>
           </w:p>
         </w:tc>
@@ -101,406 +163,116 @@
         <w:tc>
           <w:tcPr>
             <w:tcW w:type="dxa" w:w="2592"/>
-            <w:shd w:val="clear" w:color="auto" w:fill="EAEAEA"/>
+            <w:shd w:val="clear" w:fill="EDF2FA"/>
           </w:tcPr>
           <w:p>
             <w:r>
               <w:rPr>
                 <w:rFonts w:ascii="Arial" w:hAnsi="Arial"/>
                 <w:b/>
-                <w:color w:val="595959"/>
+                <w:i w:val="0"/>
+                <w:color w:val="5E6670"/>
+                <w:sz w:val="14"/>
+              </w:rPr>
+              <w:t>Date of Service</w:t>
+              <w:br/>
+            </w:r>
+            <w:r>
+              <w:rPr>
+                <w:rFonts w:ascii="Arial" w:hAnsi="Arial"/>
+                <w:b w:val="0"/>
+                <w:i w:val="0"/>
+                <w:color w:val="232830"/>
                 <w:sz w:val="16"/>
               </w:rPr>
-              <w:t>DOB</w:t>
+              <w:t>05/21/2026</w:t>
             </w:r>
           </w:p>
         </w:tc>
         <w:tc>
           <w:tcPr>
             <w:tcW w:type="dxa" w:w="2592"/>
-            <w:shd w:val="clear" w:color="auto" w:fill="EAEAEA"/>
+            <w:shd w:val="clear" w:fill="EDF2FA"/>
           </w:tcPr>
           <w:p>
             <w:r>
               <w:rPr>
                 <w:rFonts w:ascii="Arial" w:hAnsi="Arial"/>
-                <w:color w:val="000000"/>
-                <w:sz w:val="18"/>
+                <w:b/>
+                <w:i w:val="0"/>
+                <w:color w:val="5E6670"/>
+                <w:sz w:val="14"/>
               </w:rPr>
-              <w:t>03/14/1958 (68 yo)</w:t>
+              <w:t>Author</w:t>
+              <w:br/>
+            </w:r>
+            <w:r>
+              <w:rPr>
+                <w:rFonts w:ascii="Arial" w:hAnsi="Arial"/>
+                <w:b w:val="0"/>
+                <w:i w:val="0"/>
+                <w:color w:val="232830"/>
+                <w:sz w:val="16"/>
+              </w:rPr>
+              <w:t>Nursing Education</w:t>
             </w:r>
           </w:p>
         </w:tc>
         <w:tc>
           <w:tcPr>
             <w:tcW w:type="dxa" w:w="2592"/>
-            <w:shd w:val="clear" w:color="auto" w:fill="EAEAEA"/>
+            <w:shd w:val="clear" w:fill="EDF2FA"/>
           </w:tcPr>
           <w:p>
             <w:r>
               <w:rPr>
                 <w:rFonts w:ascii="Arial" w:hAnsi="Arial"/>
                 <w:b/>
-                <w:color w:val="595959"/>
+                <w:i w:val="0"/>
+                <w:color w:val="5E6670"/>
+                <w:sz w:val="14"/>
+              </w:rPr>
+              <w:t>Allergies</w:t>
+              <w:br/>
+            </w:r>
+            <w:r>
+              <w:rPr>
+                <w:rFonts w:ascii="Arial" w:hAnsi="Arial"/>
+                <w:b w:val="0"/>
+                <w:i w:val="0"/>
+                <w:color w:val="232830"/>
                 <w:sz w:val="16"/>
               </w:rPr>
-              <w:t>Sex</w:t>
+              <w:t>Sulfa (sulfonamide antibiotics) - rash</w:t>
             </w:r>
           </w:p>
         </w:tc>
         <w:tc>
           <w:tcPr>
             <w:tcW w:type="dxa" w:w="2592"/>
-            <w:shd w:val="clear" w:color="auto" w:fill="EAEAEA"/>
-          </w:tcPr>
-          <w:p>
-            <w:r>
-              <w:rPr>
-                <w:rFonts w:ascii="Arial" w:hAnsi="Arial"/>
-                <w:color w:val="000000"/>
-                <w:sz w:val="18"/>
-              </w:rPr>
-              <w:t>Female</w:t>
-            </w:r>
-          </w:p>
-        </w:tc>
-      </w:tr>
-      <w:tr>
-        <w:tc>
-          <w:tcPr>
-            <w:tcW w:type="dxa" w:w="2592"/>
-            <w:shd w:val="clear" w:color="auto" w:fill="EAEAEA"/>
+            <w:shd w:val="clear" w:fill="EDF2FA"/>
           </w:tcPr>
           <w:p>
             <w:r>
               <w:rPr>
                 <w:rFonts w:ascii="Arial" w:hAnsi="Arial"/>
                 <w:b/>
-                <w:color w:val="595959"/>
-                <w:sz w:val="16"/>
+                <w:i w:val="0"/>
+                <w:color w:val="5E6670"/>
+                <w:sz w:val="14"/>
               </w:rPr>
-              <w:t>Code Status</w:t>
+              <w:t>Document</w:t>
+              <w:br/>
             </w:r>
-          </w:p>
-        </w:tc>
-        <w:tc>
-          <w:tcPr>
-            <w:tcW w:type="dxa" w:w="2592"/>
-            <w:shd w:val="clear" w:color="auto" w:fill="EAEAEA"/>
-          </w:tcPr>
-          <w:p>
             <w:r>
               <w:rPr>
                 <w:rFonts w:ascii="Arial" w:hAnsi="Arial"/>
-                <w:color w:val="000000"/>
-                <w:sz w:val="18"/>
-              </w:rPr>
-              <w:t>Full Code</w:t>
-            </w:r>
-          </w:p>
-        </w:tc>
-        <w:tc>
-          <w:tcPr>
-            <w:tcW w:type="dxa" w:w="2592"/>
-            <w:shd w:val="clear" w:color="auto" w:fill="EAEAEA"/>
-          </w:tcPr>
-          <w:p>
-            <w:r>
-              <w:rPr>
-                <w:rFonts w:ascii="Arial" w:hAnsi="Arial"/>
-                <w:b/>
-                <w:color w:val="595959"/>
+                <w:b w:val="0"/>
+                <w:i w:val="0"/>
+                <w:color w:val="232830"/>
                 <w:sz w:val="16"/>
               </w:rPr>
-              <w:t>Allergies</w:t>
-            </w:r>
-          </w:p>
-        </w:tc>
-        <w:tc>
-          <w:tcPr>
-            <w:tcW w:type="dxa" w:w="2592"/>
-            <w:shd w:val="clear" w:color="auto" w:fill="EAEAEA"/>
-          </w:tcPr>
-          <w:p>
-            <w:r>
-              <w:rPr>
-                <w:rFonts w:ascii="Arial" w:hAnsi="Arial"/>
-                <w:color w:val="000000"/>
-                <w:sz w:val="18"/>
-              </w:rPr>
-              <w:t>Sulfa (sulfonamide antibiotics) - rash</w:t>
-            </w:r>
-          </w:p>
-        </w:tc>
-      </w:tr>
-      <w:tr>
-        <w:tc>
-          <w:tcPr>
-            <w:tcW w:type="dxa" w:w="2592"/>
-            <w:shd w:val="clear" w:color="auto" w:fill="EAEAEA"/>
-          </w:tcPr>
-          <w:p>
-            <w:r>
-              <w:rPr>
-                <w:rFonts w:ascii="Arial" w:hAnsi="Arial"/>
-                <w:b/>
-                <w:color w:val="595959"/>
-                <w:sz w:val="16"/>
-              </w:rPr>
-              <w:t>CSN</w:t>
-            </w:r>
-          </w:p>
-        </w:tc>
-        <w:tc>
-          <w:tcPr>
-            <w:tcW w:type="dxa" w:w="2592"/>
-            <w:shd w:val="clear" w:color="auto" w:fill="EAEAEA"/>
-          </w:tcPr>
-          <w:p>
-            <w:r>
-              <w:rPr>
-                <w:rFonts w:ascii="Arial" w:hAnsi="Arial"/>
-                <w:color w:val="000000"/>
-                <w:sz w:val="18"/>
-              </w:rPr>
-              <w:t>CSN-308852140</w:t>
-            </w:r>
-          </w:p>
-        </w:tc>
-        <w:tc>
-          <w:tcPr>
-            <w:tcW w:type="dxa" w:w="2592"/>
-            <w:shd w:val="clear" w:color="auto" w:fill="EAEAEA"/>
-          </w:tcPr>
-          <w:p>
-            <w:r>
-              <w:rPr>
-                <w:rFonts w:ascii="Arial" w:hAnsi="Arial"/>
-                <w:b/>
-                <w:color w:val="595959"/>
-                <w:sz w:val="16"/>
-              </w:rPr>
-              <w:t>Admit</w:t>
-            </w:r>
-          </w:p>
-        </w:tc>
-        <w:tc>
-          <w:tcPr>
-            <w:tcW w:type="dxa" w:w="2592"/>
-            <w:shd w:val="clear" w:color="auto" w:fill="EAEAEA"/>
-          </w:tcPr>
-          <w:p>
-            <w:r>
-              <w:rPr>
-                <w:rFonts w:ascii="Arial" w:hAnsi="Arial"/>
-                <w:color w:val="000000"/>
-                <w:sz w:val="18"/>
-              </w:rPr>
-              <w:t>05/16/2026</w:t>
-            </w:r>
-          </w:p>
-        </w:tc>
-      </w:tr>
-      <w:tr>
-        <w:tc>
-          <w:tcPr>
-            <w:tcW w:type="dxa" w:w="2592"/>
-            <w:shd w:val="clear" w:color="auto" w:fill="EAEAEA"/>
-          </w:tcPr>
-          <w:p>
-            <w:r>
-              <w:rPr>
-                <w:rFonts w:ascii="Arial" w:hAnsi="Arial"/>
-                <w:b/>
-                <w:color w:val="595959"/>
-                <w:sz w:val="16"/>
-              </w:rPr>
-              <w:t>Hospital Day</w:t>
-            </w:r>
-          </w:p>
-        </w:tc>
-        <w:tc>
-          <w:tcPr>
-            <w:tcW w:type="dxa" w:w="2592"/>
-            <w:shd w:val="clear" w:color="auto" w:fill="EAEAEA"/>
-          </w:tcPr>
-          <w:p>
-            <w:r>
-              <w:rPr>
-                <w:rFonts w:ascii="Arial" w:hAnsi="Arial"/>
-                <w:color w:val="000000"/>
-                <w:sz w:val="18"/>
-              </w:rPr>
-              <w:t>HD6</w:t>
-            </w:r>
-          </w:p>
-        </w:tc>
-        <w:tc>
-          <w:tcPr>
-            <w:tcW w:type="dxa" w:w="2592"/>
-            <w:shd w:val="clear" w:color="auto" w:fill="EAEAEA"/>
-          </w:tcPr>
-          <w:p>
-            <w:r>
-              <w:rPr>
-                <w:rFonts w:ascii="Arial" w:hAnsi="Arial"/>
-                <w:b/>
-                <w:color w:val="595959"/>
-                <w:sz w:val="16"/>
-              </w:rPr>
-              <w:t>Attending</w:t>
-            </w:r>
-          </w:p>
-        </w:tc>
-        <w:tc>
-          <w:tcPr>
-            <w:tcW w:type="dxa" w:w="2592"/>
-            <w:shd w:val="clear" w:color="auto" w:fill="EAEAEA"/>
-          </w:tcPr>
-          <w:p>
-            <w:r>
-              <w:rPr>
-                <w:rFonts w:ascii="Arial" w:hAnsi="Arial"/>
-                <w:color w:val="000000"/>
-                <w:sz w:val="18"/>
-              </w:rPr>
-              <w:t>Marisol Everet, MD</w:t>
-            </w:r>
-          </w:p>
-        </w:tc>
-      </w:tr>
-      <w:tr>
-        <w:tc>
-          <w:tcPr>
-            <w:tcW w:type="dxa" w:w="2592"/>
-            <w:shd w:val="clear" w:color="auto" w:fill="EAEAEA"/>
-          </w:tcPr>
-          <w:p>
-            <w:r>
-              <w:rPr>
-                <w:rFonts w:ascii="Arial" w:hAnsi="Arial"/>
-                <w:b/>
-                <w:color w:val="595959"/>
-                <w:sz w:val="16"/>
-              </w:rPr>
-              <w:t>Location</w:t>
-            </w:r>
-          </w:p>
-        </w:tc>
-        <w:tc>
-          <w:tcPr>
-            <w:tcW w:type="dxa" w:w="2592"/>
-            <w:shd w:val="clear" w:color="auto" w:fill="EAEAEA"/>
-          </w:tcPr>
-          <w:p>
-            <w:r>
-              <w:rPr>
-                <w:rFonts w:ascii="Arial" w:hAnsi="Arial"/>
-                <w:color w:val="000000"/>
-                <w:sz w:val="18"/>
-              </w:rPr>
-              <w:t>6 South Medicine - 6S-214</w:t>
-            </w:r>
-          </w:p>
-        </w:tc>
-        <w:tc>
-          <w:tcPr>
-            <w:tcW w:type="dxa" w:w="2592"/>
-            <w:shd w:val="clear" w:color="auto" w:fill="EAEAEA"/>
-          </w:tcPr>
-          <w:p>
-            <w:r>
-              <w:rPr>
-                <w:rFonts w:ascii="Arial" w:hAnsi="Arial"/>
-                <w:b/>
-                <w:color w:val="595959"/>
-                <w:sz w:val="16"/>
-              </w:rPr>
-              <w:t>Service</w:t>
-            </w:r>
-          </w:p>
-        </w:tc>
-        <w:tc>
-          <w:tcPr>
-            <w:tcW w:type="dxa" w:w="2592"/>
-            <w:shd w:val="clear" w:color="auto" w:fill="EAEAEA"/>
-          </w:tcPr>
-          <w:p>
-            <w:r>
-              <w:rPr>
-                <w:rFonts w:ascii="Arial" w:hAnsi="Arial"/>
-                <w:color w:val="000000"/>
-                <w:sz w:val="18"/>
-              </w:rPr>
-              <w:t>Hospital Medicine</w:t>
-            </w:r>
-          </w:p>
-        </w:tc>
-      </w:tr>
-      <w:tr>
-        <w:tc>
-          <w:tcPr>
-            <w:tcW w:type="dxa" w:w="2592"/>
-            <w:shd w:val="clear" w:color="auto" w:fill="EAEAEA"/>
-          </w:tcPr>
-          <w:p>
-            <w:r>
-              <w:rPr>
-                <w:rFonts w:ascii="Arial" w:hAnsi="Arial"/>
-                <w:b/>
-                <w:color w:val="595959"/>
-                <w:sz w:val="16"/>
-              </w:rPr>
-              <w:t>Language</w:t>
-            </w:r>
-          </w:p>
-        </w:tc>
-        <w:tc>
-          <w:tcPr>
-            <w:tcW w:type="dxa" w:w="2592"/>
-            <w:shd w:val="clear" w:color="auto" w:fill="EAEAEA"/>
-          </w:tcPr>
-          <w:p>
-            <w:r>
-              <w:rPr>
-                <w:rFonts w:ascii="Arial" w:hAnsi="Arial"/>
-                <w:color w:val="000000"/>
-                <w:sz w:val="18"/>
-              </w:rPr>
-              <w:t>Spanish preferred (interpreter used)</w:t>
-            </w:r>
-          </w:p>
-        </w:tc>
-        <w:tc>
-          <w:tcPr>
-            <w:tcW w:type="dxa" w:w="2592"/>
-            <w:shd w:val="clear" w:color="auto" w:fill="EAEAEA"/>
-          </w:tcPr>
-          <w:p>
-            <w:r>
-              <w:rPr>
-                <w:rFonts w:ascii="Arial" w:hAnsi="Arial"/>
-                <w:b/>
-                <w:color w:val="595959"/>
-                <w:sz w:val="16"/>
-              </w:rPr>
-              <w:t>Date of Service</w:t>
-            </w:r>
-          </w:p>
-        </w:tc>
-        <w:tc>
-          <w:tcPr>
-            <w:tcW w:type="dxa" w:w="2592"/>
-            <w:shd w:val="clear" w:color="auto" w:fill="EAEAEA"/>
-          </w:tcPr>
-          <w:p>
-            <w:r>
-              <w:rPr>
-                <w:rFonts w:ascii="Arial" w:hAnsi="Arial"/>
-                <w:color w:val="000000"/>
-                <w:sz w:val="18"/>
-              </w:rPr>
-              <w:t>05/21/2026</w:t>
+              <w:t>PATIENT EDUCATION</w:t>
             </w:r>
           </w:p>
         </w:tc>
@@ -512,8 +284,9 @@
         <w:rPr>
           <w:rFonts w:ascii="Arial" w:hAnsi="Arial"/>
           <w:b/>
-          <w:color w:val="000000"/>
-          <w:sz w:val="24"/>
+          <w:i w:val="0"/>
+          <w:color w:val="1F3864"/>
+          <w:sz w:val="28"/>
         </w:rPr>
         <w:t>DIABETIC FOOT CARE EDUCATION</w:t>
       </w:r>
@@ -522,24 +295,265 @@
       <w:r>
         <w:rPr>
           <w:rFonts w:ascii="Arial" w:hAnsi="Arial"/>
-          <w:color w:val="595959"/>
-          <w:sz w:val="17"/>
+          <w:b w:val="0"/>
+          <w:i w:val="0"/>
+          <w:color w:val="5E6670"/>
+          <w:sz w:val="16"/>
         </w:rPr>
         <w:t>Author: Nursing Education | Date of Service: 05/21/2026 | Status: Handout</w:t>
       </w:r>
     </w:p>
-    <w:p/>
     <w:p>
       <w:pPr>
+        <w:spacing w:before="180" w:after="60"/>
         <w:pBdr>
-          <w:bottom w:val="single" w:sz="4" w:space="1" w:color="BFBFBF"/>
+          <w:bottom w:val="single" w:sz="6" w:color="C9D4EA" w:space="2"/>
         </w:pBdr>
       </w:pPr>
       <w:r>
         <w:rPr>
           <w:rFonts w:ascii="Arial" w:hAnsi="Arial"/>
           <w:b/>
-          <w:color w:val="000000"/>
+          <w:i w:val="0"/>
+          <w:color w:val="4472C4"/>
+          <w:sz w:val="20"/>
+        </w:rPr>
+        <w:t>PATIENT / ENCOUNTER</w:t>
+      </w:r>
+    </w:p>
+    <w:p>
+      <w:r>
+        <w:rPr>
+          <w:rFonts w:ascii="Arial" w:hAnsi="Arial"/>
+          <w:b/>
+          <w:i w:val="0"/>
+          <w:color w:val="232830"/>
+          <w:sz w:val="18"/>
+        </w:rPr>
+        <w:t xml:space="preserve">Patient: </w:t>
+      </w:r>
+      <w:r>
+        <w:rPr>
+          <w:rFonts w:ascii="Arial" w:hAnsi="Arial"/>
+          <w:b w:val="0"/>
+          <w:i w:val="0"/>
+          <w:color w:val="232830"/>
+          <w:sz w:val="18"/>
+        </w:rPr>
+        <w:t>Ondina Vasquell, 68 y</w:t>
+      </w:r>
+    </w:p>
+    <w:p>
+      <w:r>
+        <w:rPr>
+          <w:rFonts w:ascii="Arial" w:hAnsi="Arial"/>
+          <w:b/>
+          <w:i w:val="0"/>
+          <w:color w:val="232830"/>
+          <w:sz w:val="18"/>
+        </w:rPr>
+        <w:t xml:space="preserve">Sex / DOB: </w:t>
+      </w:r>
+      <w:r>
+        <w:rPr>
+          <w:rFonts w:ascii="Arial" w:hAnsi="Arial"/>
+          <w:b w:val="0"/>
+          <w:i w:val="0"/>
+          <w:color w:val="232830"/>
+          <w:sz w:val="18"/>
+        </w:rPr>
+        <w:t>Female / 03/14/1958</w:t>
+      </w:r>
+    </w:p>
+    <w:p>
+      <w:r>
+        <w:rPr>
+          <w:rFonts w:ascii="Arial" w:hAnsi="Arial"/>
+          <w:b/>
+          <w:i w:val="0"/>
+          <w:color w:val="232830"/>
+          <w:sz w:val="18"/>
+        </w:rPr>
+        <w:t xml:space="preserve">MRN / FIN: </w:t>
+      </w:r>
+      <w:r>
+        <w:rPr>
+          <w:rFonts w:ascii="Arial" w:hAnsi="Arial"/>
+          <w:b w:val="0"/>
+          <w:i w:val="0"/>
+          <w:color w:val="232830"/>
+          <w:sz w:val="18"/>
+        </w:rPr>
+        <w:t>OV-3358104 / FIN-2207733</w:t>
+      </w:r>
+    </w:p>
+    <w:p>
+      <w:r>
+        <w:rPr>
+          <w:rFonts w:ascii="Arial" w:hAnsi="Arial"/>
+          <w:b/>
+          <w:i w:val="0"/>
+          <w:color w:val="232830"/>
+          <w:sz w:val="18"/>
+        </w:rPr>
+        <w:t xml:space="preserve">Unit / Room: </w:t>
+      </w:r>
+      <w:r>
+        <w:rPr>
+          <w:rFonts w:ascii="Arial" w:hAnsi="Arial"/>
+          <w:b w:val="0"/>
+          <w:i w:val="0"/>
+          <w:color w:val="232830"/>
+          <w:sz w:val="18"/>
+        </w:rPr>
+        <w:t>6 South Medicine / 6S-214</w:t>
+      </w:r>
+    </w:p>
+    <w:p>
+      <w:r>
+        <w:rPr>
+          <w:rFonts w:ascii="Arial" w:hAnsi="Arial"/>
+          <w:b/>
+          <w:i w:val="0"/>
+          <w:color w:val="232830"/>
+          <w:sz w:val="18"/>
+        </w:rPr>
+        <w:t xml:space="preserve">Code Status: </w:t>
+      </w:r>
+      <w:r>
+        <w:rPr>
+          <w:rFonts w:ascii="Arial" w:hAnsi="Arial"/>
+          <w:b w:val="0"/>
+          <w:i w:val="0"/>
+          <w:color w:val="232830"/>
+          <w:sz w:val="18"/>
+        </w:rPr>
+        <w:t>Full Code</w:t>
+      </w:r>
+    </w:p>
+    <w:p>
+      <w:r>
+        <w:rPr>
+          <w:rFonts w:ascii="Arial" w:hAnsi="Arial"/>
+          <w:b/>
+          <w:i w:val="0"/>
+          <w:color w:val="232830"/>
+          <w:sz w:val="18"/>
+        </w:rPr>
+        <w:t xml:space="preserve">Allergies: </w:t>
+      </w:r>
+      <w:r>
+        <w:rPr>
+          <w:rFonts w:ascii="Arial" w:hAnsi="Arial"/>
+          <w:b w:val="0"/>
+          <w:i w:val="0"/>
+          <w:color w:val="232830"/>
+          <w:sz w:val="18"/>
+        </w:rPr>
+        <w:t>Sulfa (sulfonamide antibiotics) - rash</w:t>
+      </w:r>
+    </w:p>
+    <w:p>
+      <w:r>
+        <w:rPr>
+          <w:rFonts w:ascii="Arial" w:hAnsi="Arial"/>
+          <w:b/>
+          <w:i w:val="0"/>
+          <w:color w:val="232830"/>
+          <w:sz w:val="18"/>
+        </w:rPr>
+        <w:t xml:space="preserve">Attending: </w:t>
+      </w:r>
+      <w:r>
+        <w:rPr>
+          <w:rFonts w:ascii="Arial" w:hAnsi="Arial"/>
+          <w:b w:val="0"/>
+          <w:i w:val="0"/>
+          <w:color w:val="232830"/>
+          <w:sz w:val="18"/>
+        </w:rPr>
+        <w:t>Marisol Everet, MD</w:t>
+      </w:r>
+    </w:p>
+    <w:p>
+      <w:r>
+        <w:rPr>
+          <w:rFonts w:ascii="Arial" w:hAnsi="Arial"/>
+          <w:b/>
+          <w:i w:val="0"/>
+          <w:color w:val="232830"/>
+          <w:sz w:val="18"/>
+        </w:rPr>
+        <w:t xml:space="preserve">Service: </w:t>
+      </w:r>
+      <w:r>
+        <w:rPr>
+          <w:rFonts w:ascii="Arial" w:hAnsi="Arial"/>
+          <w:b w:val="0"/>
+          <w:i w:val="0"/>
+          <w:color w:val="232830"/>
+          <w:sz w:val="18"/>
+        </w:rPr>
+        <w:t>Hospital Medicine</w:t>
+      </w:r>
+    </w:p>
+    <w:p>
+      <w:r>
+        <w:rPr>
+          <w:rFonts w:ascii="Arial" w:hAnsi="Arial"/>
+          <w:b/>
+          <w:i w:val="0"/>
+          <w:color w:val="232830"/>
+          <w:sz w:val="18"/>
+        </w:rPr>
+        <w:t xml:space="preserve">Date of Service: </w:t>
+      </w:r>
+      <w:r>
+        <w:rPr>
+          <w:rFonts w:ascii="Arial" w:hAnsi="Arial"/>
+          <w:b w:val="0"/>
+          <w:i w:val="0"/>
+          <w:color w:val="232830"/>
+          <w:sz w:val="18"/>
+        </w:rPr>
+        <w:t>05/21/2026</w:t>
+      </w:r>
+    </w:p>
+    <w:p>
+      <w:r>
+        <w:rPr>
+          <w:rFonts w:ascii="Arial" w:hAnsi="Arial"/>
+          <w:b/>
+          <w:i w:val="0"/>
+          <w:color w:val="232830"/>
+          <w:sz w:val="18"/>
+        </w:rPr>
+        <w:t xml:space="preserve">Language: </w:t>
+      </w:r>
+      <w:r>
+        <w:rPr>
+          <w:rFonts w:ascii="Arial" w:hAnsi="Arial"/>
+          <w:b w:val="0"/>
+          <w:i w:val="0"/>
+          <w:color w:val="232830"/>
+          <w:sz w:val="18"/>
+        </w:rPr>
+        <w:t>Spanish preferred (interpreter used)</w:t>
+      </w:r>
+    </w:p>
+    <w:p>
+      <w:pPr>
+        <w:spacing w:before="180" w:after="60"/>
+        <w:pBdr>
+          <w:bottom w:val="single" w:sz="6" w:color="C9D4EA" w:space="2"/>
+        </w:pBdr>
+      </w:pPr>
+      <w:r>
+        <w:rPr>
+          <w:rFonts w:ascii="Arial" w:hAnsi="Arial"/>
+          <w:b/>
+          <w:i w:val="0"/>
+          <w:color w:val="4472C4"/>
           <w:sz w:val="20"/>
         </w:rPr>
         <w:t>GENERAL FOOT CARE</w:t>
@@ -548,11 +562,14 @@
     <w:p>
       <w:pPr>
         <w:pStyle w:val="ListBullet"/>
+        <w:spacing w:after="30"/>
       </w:pPr>
       <w:r>
         <w:rPr>
           <w:rFonts w:ascii="Arial" w:hAnsi="Arial"/>
-          <w:color w:val="000000"/>
+          <w:b w:val="0"/>
+          <w:i w:val="0"/>
+          <w:color w:val="232830"/>
           <w:sz w:val="19"/>
         </w:rPr>
         <w:t>Check both feet daily for redness, sores, or drainage.</w:t>
@@ -561,11 +578,14 @@
     <w:p>
       <w:pPr>
         <w:pStyle w:val="ListBullet"/>
+        <w:spacing w:after="30"/>
       </w:pPr>
       <w:r>
         <w:rPr>
           <w:rFonts w:ascii="Arial" w:hAnsi="Arial"/>
-          <w:color w:val="000000"/>
+          <w:b w:val="0"/>
+          <w:i w:val="0"/>
+          <w:color w:val="232830"/>
           <w:sz w:val="19"/>
         </w:rPr>
         <w:t>Keep feet clean and dry; moisturize skin but not between the toes.</w:t>
@@ -574,11 +594,14 @@
     <w:p>
       <w:pPr>
         <w:pStyle w:val="ListBullet"/>
+        <w:spacing w:after="30"/>
       </w:pPr>
       <w:r>
         <w:rPr>
           <w:rFonts w:ascii="Arial" w:hAnsi="Arial"/>
-          <w:color w:val="000000"/>
+          <w:b w:val="0"/>
+          <w:i w:val="0"/>
+          <w:color w:val="232830"/>
           <w:sz w:val="19"/>
         </w:rPr>
         <w:t>Do not walk barefoot; wear well-fitting footwear.</w:t>
@@ -587,11 +610,14 @@
     <w:p>
       <w:pPr>
         <w:pStyle w:val="ListBullet"/>
+        <w:spacing w:after="30"/>
       </w:pPr>
       <w:r>
         <w:rPr>
           <w:rFonts w:ascii="Arial" w:hAnsi="Arial"/>
-          <w:color w:val="000000"/>
+          <w:b w:val="0"/>
+          <w:i w:val="0"/>
+          <w:color w:val="232830"/>
           <w:sz w:val="19"/>
         </w:rPr>
         <w:t>Keep blood sugar in the target range.</w:t>
@@ -600,11 +626,14 @@
     <w:p>
       <w:pPr>
         <w:pStyle w:val="ListBullet"/>
+        <w:spacing w:after="30"/>
       </w:pPr>
       <w:r>
         <w:rPr>
           <w:rFonts w:ascii="Arial" w:hAnsi="Arial"/>
-          <w:color w:val="000000"/>
+          <w:b w:val="0"/>
+          <w:i w:val="0"/>
+          <w:color w:val="232830"/>
           <w:sz w:val="19"/>
         </w:rPr>
         <w:t>Attend regular foot and eye examinations.</w:t>
@@ -614,20 +643,28 @@
       <w:r>
         <w:rPr>
           <w:rFonts w:ascii="Arial" w:hAnsi="Arial"/>
-          <w:color w:val="000000"/>
+          <w:b w:val="0"/>
+          <w:i w:val="0"/>
+          <w:color w:val="232830"/>
           <w:sz w:val="19"/>
         </w:rPr>
         <w:t>Generic educational handout for diabetic foot care. Reinforced with interpreter.</w:t>
       </w:r>
     </w:p>
-    <w:p/>
     <w:p>
+      <w:pPr>
+        <w:spacing w:before="200"/>
+        <w:pBdr>
+          <w:top w:val="single" w:sz="4" w:color="C9D4EA" w:space="4"/>
+        </w:pBdr>
+      </w:pPr>
       <w:r>
         <w:rPr>
           <w:rFonts w:ascii="Arial" w:hAnsi="Arial"/>
+          <w:b w:val="0"/>
           <w:i/>
-          <w:color w:val="000000"/>
-          <w:sz w:val="19"/>
+          <w:color w:val="5E6670"/>
+          <w:sz w:val="18"/>
         </w:rPr>
         <w:t>Patient education material</w:t>
       </w:r>
@@ -652,8 +689,18 @@
 <w:ftr xmlns:m="http://schemas.openxmlformats.org/officeDocument/2006/math" xmlns:mc="http://schemas.openxmlformats.org/markup-compatibility/2006" xmlns:mo="http://schemas.microsoft.com/office/mac/office/2008/main" xmlns:mv="urn:schemas-microsoft-com:mac:vml" xmlns:o="urn:schemas-microsoft-com:office:office" xmlns:r="http://schemas.openxmlformats.org/officeDocument/2006/relationships" xmlns:v="urn:schemas-microsoft-com:vml" xmlns:w10="urn:schemas-microsoft-com:office:word" xmlns:w14="http://schemas.microsoft.com/office/word/2010/wordml" xmlns:w="http://schemas.openxmlformats.org/wordprocessingml/2006/main" xmlns:wne="http://schemas.microsoft.com/office/word/2006/wordml" xmlns:wp14="http://schemas.microsoft.com/office/word/2010/wordprocessingDrawing" xmlns:wp="http://schemas.openxmlformats.org/drawingml/2006/wordprocessingDrawing" xmlns:wpc="http://schemas.microsoft.com/office/word/2010/wordprocessingCanvas" xmlns:wpg="http://schemas.microsoft.com/office/word/2010/wordprocessingGroup" xmlns:wpi="http://schemas.microsoft.com/office/word/2010/wordprocessingInk" xmlns:wps="http://schemas.microsoft.com/office/word/2010/wordprocessingShape" mc:Ignorable="w14 wp14">
   <w:p>
     <w:pPr>
-      <w:pStyle w:val="Footer"/>
-    </w:pPr>
+      <w:jc w:val="center"/>
+    </w:pPr>
+    <w:r>
+      <w:rPr>
+        <w:rFonts w:ascii="Arial" w:hAnsi="Arial"/>
+        <w:b w:val="0"/>
+        <w:i w:val="0"/>
+        <w:color w:val="5E6670"/>
+        <w:sz w:val="15"/>
+      </w:rPr>
+      <w:t>Harbor Crest Regional Medical Center  |  PATIENT EDUCATION  |  Confidential</w:t>
+    </w:r>
   </w:p>
 </w:ftr>
 </file>
@@ -662,8 +709,18 @@
 <w:ftr xmlns:m="http://schemas.openxmlformats.org/officeDocument/2006/math" xmlns:mc="http://schemas.openxmlformats.org/markup-compatibility/2006" xmlns:mo="http://schemas.microsoft.com/office/mac/office/2008/main" xmlns:mv="urn:schemas-microsoft-com:mac:vml" xmlns:o="urn:schemas-microsoft-com:office:office" xmlns:r="http://schemas.openxmlformats.org/officeDocument/2006/relationships" xmlns:v="urn:schemas-microsoft-com:vml" xmlns:w10="urn:schemas-microsoft-com:office:word" xmlns:w14="http://schemas.microsoft.com/office/word/2010/wordml" xmlns:w="http://schemas.openxmlformats.org/wordprocessingml/2006/main" xmlns:wne="http://schemas.microsoft.com/office/word/2006/wordml" xmlns:wp14="http://schemas.microsoft.com/office/word/2010/wordprocessingDrawing" xmlns:wp="http://schemas.openxmlformats.org/drawingml/2006/wordprocessingDrawing" xmlns:wpc="http://schemas.microsoft.com/office/word/2010/wordprocessingCanvas" xmlns:wpg="http://schemas.microsoft.com/office/word/2010/wordprocessingGroup" xmlns:wpi="http://schemas.microsoft.com/office/word/2010/wordprocessingInk" xmlns:wps="http://schemas.microsoft.com/office/word/2010/wordprocessingShape" mc:Ignorable="w14 wp14">
   <w:p>
     <w:pPr>
-      <w:pStyle w:val="Footer"/>
-    </w:pPr>
+      <w:jc w:val="center"/>
+    </w:pPr>
+    <w:r>
+      <w:rPr>
+        <w:rFonts w:ascii="Arial" w:hAnsi="Arial"/>
+        <w:b w:val="0"/>
+        <w:i w:val="0"/>
+        <w:color w:val="5E6670"/>
+        <w:sz w:val="15"/>
+      </w:rPr>
+      <w:t>Harbor Crest Regional Medical Center  |  PATIENT EDUCATION  |  Confidential</w:t>
+    </w:r>
   </w:p>
 </w:ftr>
 </file>
@@ -672,8 +729,18 @@
 <w:ftr xmlns:m="http://schemas.openxmlformats.org/officeDocument/2006/math" xmlns:mc="http://schemas.openxmlformats.org/markup-compatibility/2006" xmlns:mo="http://schemas.microsoft.com/office/mac/office/2008/main" xmlns:mv="urn:schemas-microsoft-com:mac:vml" xmlns:o="urn:schemas-microsoft-com:office:office" xmlns:r="http://schemas.openxmlformats.org/officeDocument/2006/relationships" xmlns:v="urn:schemas-microsoft-com:vml" xmlns:w10="urn:schemas-microsoft-com:office:word" xmlns:w14="http://schemas.microsoft.com/office/word/2010/wordml" xmlns:w="http://schemas.openxmlformats.org/wordprocessingml/2006/main" xmlns:wne="http://schemas.microsoft.com/office/word/2006/wordml" xmlns:wp14="http://schemas.microsoft.com/office/word/2010/wordprocessingDrawing" xmlns:wp="http://schemas.openxmlformats.org/drawingml/2006/wordprocessingDrawing" xmlns:wpc="http://schemas.microsoft.com/office/word/2010/wordprocessingCanvas" xmlns:wpg="http://schemas.microsoft.com/office/word/2010/wordprocessingGroup" xmlns:wpi="http://schemas.microsoft.com/office/word/2010/wordprocessingInk" xmlns:wps="http://schemas.microsoft.com/office/word/2010/wordprocessingShape" mc:Ignorable="w14 wp14">
   <w:p>
     <w:pPr>
-      <w:pStyle w:val="Footer"/>
-    </w:pPr>
+      <w:jc w:val="center"/>
+    </w:pPr>
+    <w:r>
+      <w:rPr>
+        <w:rFonts w:ascii="Arial" w:hAnsi="Arial"/>
+        <w:b w:val="0"/>
+        <w:i w:val="0"/>
+        <w:color w:val="5E6670"/>
+        <w:sz w:val="15"/>
+      </w:rPr>
+      <w:t>Harbor Crest Regional Medical Center  |  PATIENT EDUCATION  |  Confidential</w:t>
+    </w:r>
   </w:p>
 </w:ftr>
 </file>
@@ -681,9 +748,16 @@
 <file path=word/header1.xml><?xml version="1.0" encoding="utf-8"?>
 <w:hdr xmlns:m="http://schemas.openxmlformats.org/officeDocument/2006/math" xmlns:mc="http://schemas.openxmlformats.org/markup-compatibility/2006" xmlns:mo="http://schemas.microsoft.com/office/mac/office/2008/main" xmlns:mv="urn:schemas-microsoft-com:mac:vml" xmlns:o="urn:schemas-microsoft-com:office:office" xmlns:r="http://schemas.openxmlformats.org/officeDocument/2006/relationships" xmlns:v="urn:schemas-microsoft-com:vml" xmlns:w10="urn:schemas-microsoft-com:office:word" xmlns:w14="http://schemas.microsoft.com/office/word/2010/wordml" xmlns:w="http://schemas.openxmlformats.org/wordprocessingml/2006/main" xmlns:wne="http://schemas.microsoft.com/office/word/2006/wordml" xmlns:wp14="http://schemas.microsoft.com/office/word/2010/wordprocessingDrawing" xmlns:wp="http://schemas.openxmlformats.org/drawingml/2006/wordprocessingDrawing" xmlns:wpc="http://schemas.microsoft.com/office/word/2010/wordprocessingCanvas" xmlns:wpg="http://schemas.microsoft.com/office/word/2010/wordprocessingGroup" xmlns:wpi="http://schemas.microsoft.com/office/word/2010/wordprocessingInk" xmlns:wps="http://schemas.microsoft.com/office/word/2010/wordprocessingShape" mc:Ignorable="w14 wp14">
   <w:p>
-    <w:pPr>
-      <w:pStyle w:val="Header"/>
-    </w:pPr>
+    <w:r>
+      <w:rPr>
+        <w:rFonts w:ascii="Arial" w:hAnsi="Arial"/>
+        <w:b w:val="0"/>
+        <w:i w:val="0"/>
+        <w:color w:val="5E6670"/>
+        <w:sz w:val="15"/>
+      </w:rPr>
+      <w:t>Ondina Vasquell  |  MRN OV-3358104</w:t>
+    </w:r>
   </w:p>
 </w:hdr>
 </file>
@@ -691,9 +765,16 @@
 <file path=word/header2.xml><?xml version="1.0" encoding="utf-8"?>
 <w:hdr xmlns:m="http://schemas.openxmlformats.org/officeDocument/2006/math" xmlns:mc="http://schemas.openxmlformats.org/markup-compatibility/2006" xmlns:mo="http://schemas.microsoft.com/office/mac/office/2008/main" xmlns:mv="urn:schemas-microsoft-com:mac:vml" xmlns:o="urn:schemas-microsoft-com:office:office" xmlns:r="http://schemas.openxmlformats.org/officeDocument/2006/relationships" xmlns:v="urn:schemas-microsoft-com:vml" xmlns:w10="urn:schemas-microsoft-com:office:word" xmlns:w14="http://schemas.microsoft.com/office/word/2010/wordml" xmlns:w="http://schemas.openxmlformats.org/wordprocessingml/2006/main" xmlns:wne="http://schemas.microsoft.com/office/word/2006/wordml" xmlns:wp14="http://schemas.microsoft.com/office/word/2010/wordprocessingDrawing" xmlns:wp="http://schemas.openxmlformats.org/drawingml/2006/wordprocessingDrawing" xmlns:wpc="http://schemas.microsoft.com/office/word/2010/wordprocessingCanvas" xmlns:wpg="http://schemas.microsoft.com/office/word/2010/wordprocessingGroup" xmlns:wpi="http://schemas.microsoft.com/office/word/2010/wordprocessingInk" xmlns:wps="http://schemas.microsoft.com/office/word/2010/wordprocessingShape" mc:Ignorable="w14 wp14">
   <w:p>
-    <w:pPr>
-      <w:pStyle w:val="Header"/>
-    </w:pPr>
+    <w:r>
+      <w:rPr>
+        <w:rFonts w:ascii="Arial" w:hAnsi="Arial"/>
+        <w:b w:val="0"/>
+        <w:i w:val="0"/>
+        <w:color w:val="5E6670"/>
+        <w:sz w:val="15"/>
+      </w:rPr>
+      <w:t>Ondina Vasquell  |  MRN OV-3358104</w:t>
+    </w:r>
   </w:p>
 </w:hdr>
 </file>
@@ -701,9 +782,16 @@
 <file path=word/header3.xml><?xml version="1.0" encoding="utf-8"?>
 <w:hdr xmlns:m="http://schemas.openxmlformats.org/officeDocument/2006/math" xmlns:mc="http://schemas.openxmlformats.org/markup-compatibility/2006" xmlns:mo="http://schemas.microsoft.com/office/mac/office/2008/main" xmlns:mv="urn:schemas-microsoft-com:mac:vml" xmlns:o="urn:schemas-microsoft-com:office:office" xmlns:r="http://schemas.openxmlformats.org/officeDocument/2006/relationships" xmlns:v="urn:schemas-microsoft-com:vml" xmlns:w10="urn:schemas-microsoft-com:office:word" xmlns:w14="http://schemas.microsoft.com/office/word/2010/wordml" xmlns:w="http://schemas.openxmlformats.org/wordprocessingml/2006/main" xmlns:wne="http://schemas.microsoft.com/office/word/2006/wordml" xmlns:wp14="http://schemas.microsoft.com/office/word/2010/wordprocessingDrawing" xmlns:wp="http://schemas.openxmlformats.org/drawingml/2006/wordprocessingDrawing" xmlns:wpc="http://schemas.microsoft.com/office/word/2010/wordprocessingCanvas" xmlns:wpg="http://schemas.microsoft.com/office/word/2010/wordprocessingGroup" xmlns:wpi="http://schemas.microsoft.com/office/word/2010/wordprocessingInk" xmlns:wps="http://schemas.microsoft.com/office/word/2010/wordprocessingShape" mc:Ignorable="w14 wp14">
   <w:p>
-    <w:pPr>
-      <w:pStyle w:val="Header"/>
-    </w:pPr>
+    <w:r>
+      <w:rPr>
+        <w:rFonts w:ascii="Arial" w:hAnsi="Arial"/>
+        <w:b w:val="0"/>
+        <w:i w:val="0"/>
+        <w:color w:val="5E6670"/>
+        <w:sz w:val="15"/>
+      </w:rPr>
+      <w:t>Ondina Vasquell  |  MRN OV-3358104</w:t>
+    </w:r>
   </w:p>
 </w:hdr>
 </file>

</xml_diff>